<commit_message>
PaaS: Virtuozzo objemová pásma (Reserved + Dynamic), Disk PaaS, Public IP
</commit_message>
<xml_diff>
--- a/README.docx
+++ b/README.docx
@@ -662,88 +662,6 @@
               <w:rPr>
                 <w:rFonts w:ascii="Consolas" w:hAnsi="Consolas"/>
               </w:rPr>
-              <w:t>IaaS_CLOUDLET_RATE_CZK</w:t>
-            </w:r>
-          </w:p>
-        </w:tc>
-        <w:tc>
-          <w:tcPr>
-            <w:tcW w:type="dxa" w:w="2880"/>
-          </w:tcPr>
-          <w:p>
-            <w:r/>
-            <w:r>
-              <w:t>PaaS cena za 1 cloudlet/měsíc, pásmo 1–10 (informativně)</w:t>
-            </w:r>
-          </w:p>
-        </w:tc>
-        <w:tc>
-          <w:tcPr>
-            <w:tcW w:type="dxa" w:w="2880"/>
-          </w:tcPr>
-          <w:p>
-            <w:r/>
-            <w:r>
-              <w:rPr>
-                <w:rFonts w:ascii="Consolas" w:hAnsi="Consolas"/>
-              </w:rPr>
-              <w:t>152.50</w:t>
-            </w:r>
-          </w:p>
-        </w:tc>
-      </w:tr>
-      <w:tr>
-        <w:tc>
-          <w:tcPr>
-            <w:tcW w:type="dxa" w:w="2880"/>
-          </w:tcPr>
-          <w:p>
-            <w:r/>
-            <w:r>
-              <w:rPr>
-                <w:rFonts w:ascii="Consolas" w:hAnsi="Consolas"/>
-              </w:rPr>
-              <w:t>IaaS_CLOUDLET_RATE_TIER2_CZK</w:t>
-            </w:r>
-          </w:p>
-        </w:tc>
-        <w:tc>
-          <w:tcPr>
-            <w:tcW w:type="dxa" w:w="2880"/>
-          </w:tcPr>
-          <w:p>
-            <w:r/>
-            <w:r>
-              <w:t>PaaS cena za 1 cloudlet/měsíc, pásmo 11+ (informativně)</w:t>
-            </w:r>
-          </w:p>
-        </w:tc>
-        <w:tc>
-          <w:tcPr>
-            <w:tcW w:type="dxa" w:w="2880"/>
-          </w:tcPr>
-          <w:p>
-            <w:r/>
-            <w:r>
-              <w:rPr>
-                <w:rFonts w:ascii="Consolas" w:hAnsi="Consolas"/>
-              </w:rPr>
-              <w:t>133.80</w:t>
-            </w:r>
-          </w:p>
-        </w:tc>
-      </w:tr>
-      <w:tr>
-        <w:tc>
-          <w:tcPr>
-            <w:tcW w:type="dxa" w:w="2880"/>
-          </w:tcPr>
-          <w:p>
-            <w:r/>
-            <w:r>
-              <w:rPr>
-                <w:rFonts w:ascii="Consolas" w:hAnsi="Consolas"/>
-              </w:rPr>
               <w:t>IaaS_PAAS_UTILIZATION</w:t>
             </w:r>
           </w:p>
@@ -755,7 +673,7 @@
           <w:p>
             <w:r/>
             <w:r>
-              <w:t>default využití pro PaaS sekci v % (UI slider 10–100)</w:t>
+              <w:t>default využití pro PaaS sekci v % (UI slider 10–100; určuje počet dynamických cloudletů)</w:t>
             </w:r>
           </w:p>
         </w:tc>
@@ -1960,7 +1878,7 @@
         <w:t>neovlivňuje cenu IaaS</w:t>
       </w:r>
       <w:r>
-        <w:t>. Modeluje Jelastic/Virtuozzo cloudlety:</w:t>
+        <w:t>. Modeluje Virtuozzo cloudlety vč. oficiálního ceníku (objemová pásma, Kč/cloudlet/měsíc = hodinová sazba × 730 h):</w:t>
       </w:r>
     </w:p>
     <w:p>
@@ -2087,28 +2005,28 @@
         <w:rPr>
           <w:b/>
         </w:rPr>
-        <w:t>vrstvená cena</w:t>
-      </w:r>
-      <w:r>
-        <w:t xml:space="preserve"> </w:t>
+        <w:t>objemová cena</w:t>
+      </w:r>
+      <w:r>
+        <w:t xml:space="preserve"> (pásma níže), efektivní průměrná sazba i cena dynamické části; </w:t>
       </w:r>
       <w:r>
         <w:rPr>
-          <w:rFonts w:ascii="Consolas" w:hAnsi="Consolas"/>
+          <w:b/>
         </w:rPr>
-        <w:t>cloudletCost(N)</w:t>
-      </w:r>
-      <w:r>
-        <w:t xml:space="preserve"> (pásmo 1–10 vs 11+), poměr závazku, efektivní průměrná sazba i utilizace (cena PaaS v sekci = </w:t>
+        <w:t>ceny za cloudlet v Kč se nemění</w:t>
+      </w:r>
+      <w:r>
+        <w:t xml:space="preserve"> — parametr mění jen </w:t>
       </w:r>
       <w:r>
         <w:rPr>
-          <w:rFonts w:ascii="Consolas" w:hAnsi="Consolas"/>
+          <w:i/>
         </w:rPr>
-        <w:t>N</w:t>
-      </w:r>
-      <w:r>
-        <w:t xml:space="preserve"> × sazba × utilization);</w:t>
+        <w:t>kolik</w:t>
+      </w:r>
+      <w:r>
+        <w:t xml:space="preserve"> cloudletů se spočte;</w:t>
       </w:r>
     </w:p>
     <w:p>
@@ -2116,22 +2034,52 @@
         <w:pStyle w:val="ListBullet"/>
       </w:pPr>
       <w:r>
+        <w:t xml:space="preserve">příklad: VM 7.2 GHz / 2.25 GiB → default (400 MHz + 128 MiB): </w:t>
+      </w:r>
+      <w:r>
+        <w:rPr>
+          <w:rFonts w:ascii="Consolas" w:hAnsi="Consolas"/>
+        </w:rPr>
+        <w:t>ceil(max(7.2/0.4, 2.25/0.125))</w:t>
+      </w:r>
+      <w:r>
+        <w:t xml:space="preserve"> = </w:t>
+      </w:r>
+      <w:r>
+        <w:rPr>
+          <w:rFonts w:ascii="Consolas" w:hAnsi="Consolas"/>
+        </w:rPr>
+        <w:t>ceil(max(18, 18))</w:t>
+      </w:r>
+      <w:r>
+        <w:t xml:space="preserve"> = </w:t>
+      </w:r>
+      <w:r>
         <w:rPr>
           <w:b/>
         </w:rPr>
-        <w:t>cena za cloudlet v Kč se nemění</w:t>
-      </w:r>
-      <w:r>
-        <w:t xml:space="preserve"> (152.50 / 133.80 Kč zůstává) — parametr mění jen </w:t>
+        <w:t>18 cloudletů</w:t>
+      </w:r>
+      <w:r>
+        <w:t xml:space="preserve">; zmenšíš-li CPU cloudletu na 200 MHz → </w:t>
       </w:r>
       <w:r>
         <w:rPr>
-          <w:i/>
+          <w:rFonts w:ascii="Consolas" w:hAnsi="Consolas"/>
         </w:rPr>
-        <w:t>kolik</w:t>
-      </w:r>
-      <w:r>
-        <w:t xml:space="preserve"> cloudletů se spočte; IaaS cena se zmnou PaaS parametrů nijak nemění (sekce je informativní);</w:t>
+        <w:t>ceil(max(36, 18))</w:t>
+      </w:r>
+      <w:r>
+        <w:t xml:space="preserve"> = </w:t>
+      </w:r>
+      <w:r>
+        <w:rPr>
+          <w:b/>
+        </w:rPr>
+        <w:t>36 cloudletů</w:t>
+      </w:r>
+      <w:r>
+        <w:t xml:space="preserve"> (dvojnásobek).</w:t>
       </w:r>
     </w:p>
     <w:p>
@@ -2139,52 +2087,22 @@
         <w:pStyle w:val="ListBullet"/>
       </w:pPr>
       <w:r>
-        <w:t xml:space="preserve">příklad: VM 7.2 GHz / 2.25 GiB → default (400 MHz + 128 MiB): </w:t>
-      </w:r>
-      <w:r>
-        <w:rPr>
-          <w:rFonts w:ascii="Consolas" w:hAnsi="Consolas"/>
-        </w:rPr>
-        <w:t>ceil(max(7.2/0.4, 2.25/0.125))</w:t>
-      </w:r>
-      <w:r>
-        <w:t xml:space="preserve"> = </w:t>
-      </w:r>
-      <w:r>
-        <w:rPr>
-          <w:rFonts w:ascii="Consolas" w:hAnsi="Consolas"/>
-        </w:rPr>
-        <w:t>ceil(max(18, 18))</w:t>
-      </w:r>
-      <w:r>
-        <w:t xml:space="preserve"> = </w:t>
-      </w:r>
-      <w:r>
         <w:rPr>
           <w:b/>
         </w:rPr>
-        <w:t>18 cloudletů</w:t>
-      </w:r>
-      <w:r>
-        <w:t xml:space="preserve">; zmenšíš-li CPU cloudletu na 200 MHz → </w:t>
-      </w:r>
-      <w:r>
-        <w:rPr>
-          <w:rFonts w:ascii="Consolas" w:hAnsi="Consolas"/>
-        </w:rPr>
-        <w:t>ceil(max(36, 18))</w:t>
-      </w:r>
-      <w:r>
-        <w:t xml:space="preserve"> = </w:t>
+        <w:t>Celkem `N`</w:t>
+      </w:r>
+      <w:r>
+        <w:t xml:space="preserve"> = součet přes všechny VM (= </w:t>
       </w:r>
       <w:r>
         <w:rPr>
           <w:b/>
         </w:rPr>
-        <w:t>36 cloudletů</w:t>
-      </w:r>
-      <w:r>
-        <w:t xml:space="preserve"> (dvojnásobek).</w:t>
+        <w:t>rezervované</w:t>
+      </w:r>
+      <w:r>
+        <w:t xml:space="preserve"> cloudlety, platí se vždy).</w:t>
       </w:r>
     </w:p>
     <w:p>
@@ -2195,10 +2113,286 @@
         <w:rPr>
           <w:b/>
         </w:rPr>
-        <w:t>Celkem</w:t>
-      </w:r>
-      <w:r>
-        <w:t xml:space="preserve"> = součet přes všechny VM.</w:t>
+        <w:t>Virtuozzo ceník cloudletů (objemová pásma na celkový počet):</w:t>
+      </w:r>
+    </w:p>
+    <w:tbl>
+      <w:tblPr>
+        <w:tblStyle w:val="TableGrid"/>
+        <w:tblW w:type="auto" w:w="0"/>
+        <w:tblLook w:firstColumn="1" w:firstRow="1" w:lastColumn="0" w:lastRow="0" w:noHBand="0" w:noVBand="1" w:val="04A0"/>
+      </w:tblPr>
+      <w:tblGrid>
+        <w:gridCol w:w="1440"/>
+        <w:gridCol w:w="1440"/>
+        <w:gridCol w:w="1440"/>
+        <w:gridCol w:w="1440"/>
+        <w:gridCol w:w="1440"/>
+        <w:gridCol w:w="1440"/>
+      </w:tblGrid>
+      <w:tr>
+        <w:tc>
+          <w:tcPr>
+            <w:tcW w:type="dxa" w:w="1440"/>
+          </w:tcPr>
+          <w:p>
+            <w:r>
+              <w:rPr>
+                <w:b/>
+              </w:rPr>
+            </w:r>
+            <w:r>
+              <w:rPr>
+                <w:b/>
+              </w:rPr>
+              <w:t>Pásmo</w:t>
+            </w:r>
+          </w:p>
+        </w:tc>
+        <w:tc>
+          <w:tcPr>
+            <w:tcW w:type="dxa" w:w="1440"/>
+          </w:tcPr>
+          <w:p>
+            <w:r>
+              <w:rPr>
+                <w:b/>
+              </w:rPr>
+            </w:r>
+            <w:r>
+              <w:rPr>
+                <w:b/>
+              </w:rPr>
+              <w:t>1–16</w:t>
+            </w:r>
+          </w:p>
+        </w:tc>
+        <w:tc>
+          <w:tcPr>
+            <w:tcW w:type="dxa" w:w="1440"/>
+          </w:tcPr>
+          <w:p>
+            <w:r>
+              <w:rPr>
+                <w:b/>
+              </w:rPr>
+            </w:r>
+            <w:r>
+              <w:rPr>
+                <w:b/>
+              </w:rPr>
+              <w:t>17–32</w:t>
+            </w:r>
+          </w:p>
+        </w:tc>
+        <w:tc>
+          <w:tcPr>
+            <w:tcW w:type="dxa" w:w="1440"/>
+          </w:tcPr>
+          <w:p>
+            <w:r>
+              <w:rPr>
+                <w:b/>
+              </w:rPr>
+            </w:r>
+            <w:r>
+              <w:rPr>
+                <w:b/>
+              </w:rPr>
+              <w:t>33–64</w:t>
+            </w:r>
+          </w:p>
+        </w:tc>
+        <w:tc>
+          <w:tcPr>
+            <w:tcW w:type="dxa" w:w="1440"/>
+          </w:tcPr>
+          <w:p>
+            <w:r>
+              <w:rPr>
+                <w:b/>
+              </w:rPr>
+            </w:r>
+            <w:r>
+              <w:rPr>
+                <w:b/>
+              </w:rPr>
+              <w:t>65–128</w:t>
+            </w:r>
+          </w:p>
+        </w:tc>
+        <w:tc>
+          <w:tcPr>
+            <w:tcW w:type="dxa" w:w="1440"/>
+          </w:tcPr>
+          <w:p>
+            <w:r>
+              <w:rPr>
+                <w:b/>
+              </w:rPr>
+            </w:r>
+            <w:r>
+              <w:rPr>
+                <w:b/>
+              </w:rPr>
+              <w:t>129+</w:t>
+            </w:r>
+          </w:p>
+        </w:tc>
+      </w:tr>
+      <w:tr>
+        <w:tc>
+          <w:tcPr>
+            <w:tcW w:type="dxa" w:w="1440"/>
+          </w:tcPr>
+          <w:p>
+            <w:r/>
+            <w:r>
+              <w:rPr>
+                <w:b/>
+              </w:rPr>
+              <w:t>Rezervované</w:t>
+            </w:r>
+            <w:r>
+              <w:t xml:space="preserve"> Kč/cl/měs</w:t>
+            </w:r>
+          </w:p>
+        </w:tc>
+        <w:tc>
+          <w:tcPr>
+            <w:tcW w:type="dxa" w:w="1440"/>
+          </w:tcPr>
+          <w:p>
+            <w:r/>
+            <w:r>
+              <w:t>98.84</w:t>
+            </w:r>
+          </w:p>
+        </w:tc>
+        <w:tc>
+          <w:tcPr>
+            <w:tcW w:type="dxa" w:w="1440"/>
+          </w:tcPr>
+          <w:p>
+            <w:r/>
+            <w:r>
+              <w:t>93.88</w:t>
+            </w:r>
+          </w:p>
+        </w:tc>
+        <w:tc>
+          <w:tcPr>
+            <w:tcW w:type="dxa" w:w="1440"/>
+          </w:tcPr>
+          <w:p>
+            <w:r/>
+            <w:r>
+              <w:t>88.91</w:t>
+            </w:r>
+          </w:p>
+        </w:tc>
+        <w:tc>
+          <w:tcPr>
+            <w:tcW w:type="dxa" w:w="1440"/>
+          </w:tcPr>
+          <w:p>
+            <w:r/>
+            <w:r>
+              <w:t>84.02</w:t>
+            </w:r>
+          </w:p>
+        </w:tc>
+        <w:tc>
+          <w:tcPr>
+            <w:tcW w:type="dxa" w:w="1440"/>
+          </w:tcPr>
+          <w:p>
+            <w:r/>
+            <w:r>
+              <w:t>79.06</w:t>
+            </w:r>
+          </w:p>
+        </w:tc>
+      </w:tr>
+      <w:tr>
+        <w:tc>
+          <w:tcPr>
+            <w:tcW w:type="dxa" w:w="1440"/>
+          </w:tcPr>
+          <w:p>
+            <w:r/>
+            <w:r>
+              <w:rPr>
+                <w:b/>
+              </w:rPr>
+              <w:t>Dynamické</w:t>
+            </w:r>
+            <w:r>
+              <w:t xml:space="preserve"> Kč/cl/měs</w:t>
+            </w:r>
+          </w:p>
+        </w:tc>
+        <w:tc>
+          <w:tcPr>
+            <w:tcW w:type="dxa" w:w="1440"/>
+          </w:tcPr>
+          <w:p>
+            <w:r/>
+            <w:r>
+              <w:t>148.26</w:t>
+            </w:r>
+          </w:p>
+        </w:tc>
+        <w:tc>
+          <w:tcPr>
+            <w:tcW w:type="dxa" w:w="1440"/>
+          </w:tcPr>
+          <w:p>
+            <w:r/>
+            <w:r>
+              <w:t>144.54</w:t>
+            </w:r>
+          </w:p>
+        </w:tc>
+        <w:tc>
+          <w:tcPr>
+            <w:tcW w:type="dxa" w:w="1440"/>
+          </w:tcPr>
+          <w:p>
+            <w:r/>
+            <w:r>
+              <w:t>140.82</w:t>
+            </w:r>
+          </w:p>
+        </w:tc>
+        <w:tc>
+          <w:tcPr>
+            <w:tcW w:type="dxa" w:w="1440"/>
+          </w:tcPr>
+          <w:p>
+            <w:r/>
+            <w:r>
+              <w:t>137.09</w:t>
+            </w:r>
+          </w:p>
+        </w:tc>
+        <w:tc>
+          <w:tcPr>
+            <w:tcW w:type="dxa" w:w="1440"/>
+          </w:tcPr>
+          <w:p>
+            <w:r/>
+            <w:r>
+              <w:t>133.44</w:t>
+            </w:r>
+          </w:p>
+        </w:tc>
+      </w:tr>
+    </w:tbl>
+    <w:p/>
+    <w:p>
+      <w:r>
+        <w:t>(Hodinové sazby × 730 h: 0.1354/0.1286/0.1218/0.1151/0.1083 → 98.84/93.88/88.91/84.02/79.06 a 0.2031/0.1980/0.1929/0.1878/0.1828 → 148.26/144.54/140.82/137.09/133.44. Sleva: rezervované 33–47 %, dynamické 0–10 %.)</w:t>
       </w:r>
     </w:p>
     <w:p>
@@ -2209,38 +2403,64 @@
         <w:rPr>
           <w:b/>
         </w:rPr>
-        <w:t>Vrstvená (objemová) cena</w:t>
-      </w:r>
-      <w:r>
-        <w:t xml:space="preserve"> dle celkového počtu cloudletů měsíčně:</w:t>
-      </w:r>
-    </w:p>
-    <w:p>
-      <w:pPr>
-        <w:ind w:left="288"/>
-      </w:pPr>
+        <w:t>Výpočet ceny</w:t>
+      </w:r>
+      <w:r>
+        <w:t xml:space="preserve">: </w:t>
+      </w:r>
       <w:r>
         <w:rPr>
           <w:rFonts w:ascii="Consolas" w:hAnsi="Consolas"/>
-          <w:sz w:val="18"/>
         </w:rPr>
-        <w:t xml:space="preserve">  cenaCloudletů(N) = N ≤ 10  → N × 152.50 Kč</w:t>
-        <w:br/>
-        <w:t xml:space="preserve">                   = jinak   → 10 × 152.50 + (N − 10) × 133.80 Kč</w:t>
-      </w:r>
-    </w:p>
-    <w:p>
-      <w:r>
-        <w:t xml:space="preserve">(Ověřeno: 10 cloudletů = 1 525 Kč; 100 cloudletů = 13 566.9 Kč ⇒ tier 2 ≈ 133.7989 → 133.80 Kč zobrazeno. Příklad: 82 cloudletů = 10×152.50 + 72×133.80 = </w:t>
+        <w:t>cloudletCost(N) = band(N, reservovanée) + band(ceil(N × utilization), dynamické)</w:t>
+      </w:r>
+      <w:r>
+        <w:t xml:space="preserve">, kde </w:t>
+      </w:r>
+      <w:r>
+        <w:rPr>
+          <w:rFonts w:ascii="Consolas" w:hAnsi="Consolas"/>
+        </w:rPr>
+        <w:t>band(n, sazby)</w:t>
+      </w:r>
+      <w:r>
+        <w:t xml:space="preserve"> rozpočítá </w:t>
+      </w:r>
+      <w:r>
+        <w:rPr>
+          <w:rFonts w:ascii="Consolas" w:hAnsi="Consolas"/>
+        </w:rPr>
+        <w:t>n</w:t>
+      </w:r>
+      <w:r>
+        <w:t xml:space="preserve"> do pásem (např. N=82: 16×98.84 + 16×93.88 + 32×88.91 + 18×84.02 = </w:t>
       </w:r>
       <w:r>
         <w:rPr>
           <w:b/>
         </w:rPr>
-        <w:t>11 158.6 Kč</w:t>
-      </w:r>
-      <w:r>
-        <w:t>.)</w:t>
+        <w:t>7 441 Kč</w:t>
+      </w:r>
+      <w:r>
+        <w:t xml:space="preserve"> rezervované; dynamické 33 = 16×148.26 + 16×144.54 + 1×140.82 = </w:t>
+      </w:r>
+      <w:r>
+        <w:rPr>
+          <w:b/>
+        </w:rPr>
+        <w:t>4 825.62 Kč</w:t>
+      </w:r>
+      <w:r>
+        <w:t xml:space="preserve">; celkem </w:t>
+      </w:r>
+      <w:r>
+        <w:rPr>
+          <w:b/>
+        </w:rPr>
+        <w:t>12 266.62 Kč</w:t>
+      </w:r>
+      <w:r>
+        <w:t>).</w:t>
       </w:r>
     </w:p>
     <w:p>
@@ -2251,7 +2471,7 @@
         <w:rPr>
           <w:b/>
         </w:rPr>
-        <w:t>Poměr závazku (PaaS)</w:t>
+        <w:t>Využití (utilizace)</w:t>
       </w:r>
       <w:r>
         <w:t xml:space="preserve">: </w:t>
@@ -2260,19 +2480,37 @@
         <w:rPr>
           <w:rFonts w:ascii="Consolas" w:hAnsi="Consolas"/>
         </w:rPr>
-        <w:t>paasCommitRatio(cm) = sazbaCPU(cm) / sazbaCPU(12m)</w:t>
-      </w:r>
-      <w:r>
-        <w:t>. Ceny obou pásem se tímto poměrem pronásobí (jako IaaS tedy: env override platí jen pro defaultní závazek). PaaS závazek se vybírá nezávisle na IaaS závazku (</w:t>
+        <w:t>paasUtil</w:t>
+      </w:r>
+      <w:r>
+        <w:t xml:space="preserve"> (default 40 %, env </w:t>
       </w:r>
       <w:r>
         <w:rPr>
           <w:rFonts w:ascii="Consolas" w:hAnsi="Consolas"/>
         </w:rPr>
-        <w:t>paasCommitSel</w:t>
-      </w:r>
-      <w:r>
-        <w:t>).</w:t>
+        <w:t>IaaS_PAAS_UTILIZATION</w:t>
+      </w:r>
+      <w:r>
+        <w:t xml:space="preserve">, UI slider 10–100 %) určuje počet </w:t>
+      </w:r>
+      <w:r>
+        <w:rPr>
+          <w:b/>
+        </w:rPr>
+        <w:t>dynamických</w:t>
+      </w:r>
+      <w:r>
+        <w:t xml:space="preserve"> cloudletů </w:t>
+      </w:r>
+      <w:r>
+        <w:rPr>
+          <w:rFonts w:ascii="Consolas" w:hAnsi="Consolas"/>
+        </w:rPr>
+        <w:t>ceil(N × utilization)</w:t>
+      </w:r>
+      <w:r>
+        <w:t>; rezervované se platí vždy beze změny. CPU/RAM v sekci se zobrazují na utilizaci (využité kapacity).</w:t>
       </w:r>
     </w:p>
     <w:p>
@@ -2283,19 +2521,10 @@
         <w:rPr>
           <w:b/>
         </w:rPr>
-        <w:t>Efektivní průměrná sazba</w:t>
-      </w:r>
-      <w:r>
-        <w:t xml:space="preserve">: </w:t>
-      </w:r>
-      <w:r>
-        <w:rPr>
-          <w:rFonts w:ascii="Consolas" w:hAnsi="Consolas"/>
-        </w:rPr>
-        <w:t>effRate = cenaCloudletů(celkem) / celkem</w:t>
-      </w:r>
-      <w:r>
-        <w:t xml:space="preserve"> — per-VM řádky ho používají, aby součet per-řádků seděl na celkovou vrstvenou cenu.</w:t>
+        <w:t>Další položky Virtuozzo</w:t>
+      </w:r>
+      <w:r>
+        <w:t xml:space="preserve"> (přičítají se k PaaS celkem, neovlivněné utilizací):</w:t>
       </w:r>
     </w:p>
     <w:p>
@@ -2306,46 +2535,19 @@
         <w:rPr>
           <w:b/>
         </w:rPr>
-        <w:t>Využití (utilizace)</w:t>
-      </w:r>
-      <w:r>
-        <w:t xml:space="preserve">: </w:t>
-      </w:r>
-      <w:r>
-        <w:rPr>
-          <w:rFonts w:ascii="Consolas" w:hAnsi="Consolas"/>
-        </w:rPr>
-        <w:t>paasUtil</w:t>
-      </w:r>
-      <w:r>
-        <w:t xml:space="preserve"> (default 40 %, env </w:t>
-      </w:r>
-      <w:r>
-        <w:rPr>
-          <w:rFonts w:ascii="Consolas" w:hAnsi="Consolas"/>
-        </w:rPr>
-        <w:t>IaaS_PAAS_UTILIZATION</w:t>
-      </w:r>
-      <w:r>
-        <w:t xml:space="preserve">, UI slider 10–100 %). Sekce „PaaS" (pořadí: </w:t>
+        <w:t>Disk PaaS</w:t>
+      </w:r>
+      <w:r>
+        <w:t xml:space="preserve"> = Σ diskGB všech VM × </w:t>
       </w:r>
       <w:r>
         <w:rPr>
           <w:b/>
         </w:rPr>
-        <w:t>CPU, RAM, Cloudlety, Cena / cloudlet, Cena (PaaS)</w:t>
-      </w:r>
-      <w:r>
-        <w:t xml:space="preserve">) počítá </w:t>
-      </w:r>
-      <w:r>
-        <w:rPr>
-          <w:rFonts w:ascii="Consolas" w:hAnsi="Consolas"/>
-        </w:rPr>
-        <w:t>celkem × utilization</w:t>
-      </w:r>
-      <w:r>
-        <w:t>:</w:t>
+        <w:t>2.40 Kč/GB/měs</w:t>
+      </w:r>
+      <w:r>
+        <w:t xml:space="preserve"> (0.003286 Kč/h × 730);</w:t>
       </w:r>
     </w:p>
     <w:p>
@@ -2354,30 +2556,30 @@
       </w:pPr>
       <w:r>
         <w:rPr>
-          <w:rFonts w:ascii="Consolas" w:hAnsi="Consolas"/>
+          <w:b/>
         </w:rPr>
-        <w:t>CPU = Σ cpuGHz × utilization/100</w:t>
-      </w:r>
-      <w:r>
-        <w:t xml:space="preserve">, </w:t>
+        <w:t>Public IP</w:t>
+      </w:r>
+      <w:r>
+        <w:t xml:space="preserve"> = </w:t>
+      </w:r>
+      <w:r>
+        <w:rPr>
+          <w:b/>
+        </w:rPr>
+        <w:t>120.01 Kč/IP/měs</w:t>
+      </w:r>
+      <w:r>
+        <w:t xml:space="preserve"> (0.1644 Kč/h × 730), jen pokud je v topologii firewall (skupina </w:t>
       </w:r>
       <w:r>
         <w:rPr>
           <w:rFonts w:ascii="Consolas" w:hAnsi="Consolas"/>
         </w:rPr>
-        <w:t>RAM = Σ ramGB × utilization/100</w:t>
-      </w:r>
-      <w:r>
-        <w:t xml:space="preserve">, </w:t>
-      </w:r>
-      <w:r>
-        <w:rPr>
-          <w:rFonts w:ascii="Consolas" w:hAnsi="Consolas"/>
-        </w:rPr>
-        <w:t>Cloudlety = round(celkem × utilization/100)</w:t>
-      </w:r>
-      <w:r>
-        <w:t>;</w:t>
+        <w:t>opnsense</w:t>
+      </w:r>
+      <w:r>
+        <w:t>);</w:t>
       </w:r>
     </w:p>
     <w:p>
@@ -2388,19 +2590,10 @@
         <w:rPr>
           <w:b/>
         </w:rPr>
-        <w:t>Cena / cloudlet (dle využití)</w:t>
-      </w:r>
-      <w:r>
-        <w:t xml:space="preserve"> = </w:t>
-      </w:r>
-      <w:r>
-        <w:rPr>
-          <w:rFonts w:ascii="Consolas" w:hAnsi="Consolas"/>
-        </w:rPr>
-        <w:t>effRate × utilization/100</w:t>
-      </w:r>
-      <w:r>
-        <w:t xml:space="preserve"> (průměrná sazba po vrstvení × využití);</w:t>
+        <w:t>External traffic</w:t>
+      </w:r>
+      <w:r>
+        <w:t xml:space="preserve"> se nekalkuluje (nemá v topologii vstup).</w:t>
       </w:r>
     </w:p>
     <w:p>
@@ -2411,10 +2604,10 @@
         <w:rPr>
           <w:b/>
         </w:rPr>
-        <w:t>cena (PaaS) = cenaCloudletů(celkem) × utilization/100</w:t>
-      </w:r>
-      <w:r>
-        <w:t>.</w:t>
+        <w:t>Úhrn „Cena PaaS celkem"</w:t>
+      </w:r>
+      <w:r>
+        <w:t xml:space="preserve"> = cena cloudletů (R + D) + Disk PaaS + Public IP.</w:t>
       </w:r>
     </w:p>
     <w:p>
@@ -2422,25 +2615,31 @@
         <w:pStyle w:val="ListBullet"/>
       </w:pPr>
       <w:r>
-        <w:t xml:space="preserve">Tabulka VM: sloupec „Cloudlety" = </w:t>
+        <w:rPr>
+          <w:b/>
+        </w:rPr>
+        <w:t>Poměr závazku (PaaS)</w:t>
+      </w:r>
+      <w:r>
+        <w:t xml:space="preserve">: </w:t>
       </w:r>
       <w:r>
         <w:rPr>
           <w:rFonts w:ascii="Consolas" w:hAnsi="Consolas"/>
         </w:rPr>
-        <w:t>round(cl × utilization/100)</w:t>
-      </w:r>
-      <w:r>
-        <w:t xml:space="preserve">, „Cena PaaS" = </w:t>
+        <w:t>paasCommitRatio(cm) = sazbaCPU(cm) / sazbaCPU(12m)</w:t>
+      </w:r>
+      <w:r>
+        <w:t>; násobí cenu cloudletů (stejná logika jako u IaaS: env override jen pro defaultní závazek). PaaS závazek se volí nezávisle (</w:t>
       </w:r>
       <w:r>
         <w:rPr>
           <w:rFonts w:ascii="Consolas" w:hAnsi="Consolas"/>
         </w:rPr>
-        <w:t>round(cl × effRate × utilization/100) Kč</w:t>
-      </w:r>
-      <w:r>
-        <w:t>.</w:t>
+        <w:t>paasCommitSel</w:t>
+      </w:r>
+      <w:r>
+        <w:t>).</w:t>
       </w:r>
     </w:p>
     <w:p>
@@ -2451,6 +2650,38 @@
         <w:rPr>
           <w:b/>
         </w:rPr>
+        <w:t>Efektivní průměrná sazba</w:t>
+      </w:r>
+      <w:r>
+        <w:t xml:space="preserve">: </w:t>
+      </w:r>
+      <w:r>
+        <w:rPr>
+          <w:rFonts w:ascii="Consolas" w:hAnsi="Consolas"/>
+        </w:rPr>
+        <w:t>effRate = cenaCloudletů(N) / N</w:t>
+      </w:r>
+      <w:r>
+        <w:t xml:space="preserve"> — per-VM řádky ji používají, aby součet seděl na celkovou cenu; per-VM „Cena PaaS" = </w:t>
+      </w:r>
+      <w:r>
+        <w:rPr>
+          <w:rFonts w:ascii="Consolas" w:hAnsi="Consolas"/>
+        </w:rPr>
+        <w:t>cl × effRate</w:t>
+      </w:r>
+      <w:r>
+        <w:t>.</w:t>
+      </w:r>
+    </w:p>
+    <w:p>
+      <w:pPr>
+        <w:pStyle w:val="ListBullet"/>
+      </w:pPr>
+      <w:r>
+        <w:rPr>
+          <w:b/>
+        </w:rPr>
         <w:t>PaaS závazek — server vs UI</w:t>
       </w:r>
       <w:r>
@@ -2463,7 +2694,7 @@
         <w:t>/api/*</w:t>
       </w:r>
       <w:r>
-        <w:t xml:space="preserve"> surovou vrstvenou cenu (</w:t>
+        <w:t xml:space="preserve"> objemovou cenu (</w:t>
       </w:r>
       <w:r>
         <w:rPr>
@@ -2512,16 +2743,7 @@
         <w:t>VM, Skupina, CPU GHz, RAM GiB, Disk GB, Tier, CPU, RAM, Disk, Cena IaaS, Cloudlety, Cena PaaS</w:t>
       </w:r>
       <w:r>
-        <w:t xml:space="preserve">). PaaS souhrn má řádky ve stejném pořadí jako web (CPU → RAM → Cloudlety → </w:t>
-      </w:r>
-      <w:r>
-        <w:rPr>
-          <w:b/>
-        </w:rPr>
-        <w:t>Cena / cloudlet (dle utilizace)</w:t>
-      </w:r>
-      <w:r>
-        <w:t xml:space="preserve"> → Cena (PaaS)). Nahoře se vloží </w:t>
+        <w:t xml:space="preserve">). PaaS souhrn má řádky ve stejném pořadí jako web (CPU → RAM → Cloudlety rezervované → Cloudlety dynamické → Cena cloudletů → Cena / cloudlet → Disk PaaS → Public IP → Cena PaaS celkem). Nahoře se vloží </w:t>
       </w:r>
       <w:r>
         <w:rPr>
@@ -2530,7 +2752,7 @@
         <w:t>obrázek topologie</w:t>
       </w:r>
       <w:r>
-        <w:t xml:space="preserve"> (html2canvas + JSZip), pokud je k dispozici; řádky se posunou tak, aby obrázek nepřekrýval text.</w:t>
+        <w:t xml:space="preserve"> (html2canvas + JSZip), pokud je k dispozici; řádky se posunou tak, aby obrázek nepřekrýval text. Sloupec „Cloudlety" v tabulce VM zobrazuje rezervovaný počet cloudletů daného VM.</w:t>
       </w:r>
     </w:p>
     <w:p>

</xml_diff>

<commit_message>
PaaS: rezervovane cloudlety = 15 % z celku, dynamicke = vyuziti - rezervace
</commit_message>
<xml_diff>
--- a/README.docx
+++ b/README.docx
@@ -2406,13 +2406,91 @@
         <w:t>Výpočet ceny</w:t>
       </w:r>
       <w:r>
-        <w:t xml:space="preserve">: </w:t>
+        <w:t>:</w:t>
+      </w:r>
+    </w:p>
+    <w:p>
+      <w:pPr>
+        <w:pStyle w:val="ListBullet"/>
+      </w:pPr>
+      <w:r>
+        <w:rPr>
+          <w:b/>
+        </w:rPr>
+        <w:t>Rezervované cloudlety R</w:t>
+      </w:r>
+      <w:r>
+        <w:t xml:space="preserve"> = vždy placené minimum = </w:t>
       </w:r>
       <w:r>
         <w:rPr>
           <w:rFonts w:ascii="Consolas" w:hAnsi="Consolas"/>
         </w:rPr>
-        <w:t>cloudletCost(N) = band(N, reservovanée) + band(ceil(N × utilization), dynamické)</w:t>
+        <w:t>ceil(N × 15 %)</w:t>
+      </w:r>
+      <w:r>
+        <w:t xml:space="preserve"> (např. 82 → 13);</w:t>
+      </w:r>
+    </w:p>
+    <w:p>
+      <w:pPr>
+        <w:pStyle w:val="ListBullet"/>
+      </w:pPr>
+      <w:r>
+        <w:rPr>
+          <w:b/>
+        </w:rPr>
+        <w:t>Dynamické cloudlety D</w:t>
+      </w:r>
+      <w:r>
+        <w:t xml:space="preserve"> = skutečně využité nad rezervací = </w:t>
+      </w:r>
+      <w:r>
+        <w:rPr>
+          <w:rFonts w:ascii="Consolas" w:hAnsi="Consolas"/>
+        </w:rPr>
+        <w:t>ceil(N × utilizace) − R</w:t>
+      </w:r>
+      <w:r>
+        <w:t xml:space="preserve"> (např. 82 @40 % → </w:t>
+      </w:r>
+      <w:r>
+        <w:rPr>
+          <w:rFonts w:ascii="Consolas" w:hAnsi="Consolas"/>
+        </w:rPr>
+        <w:t>33 − 13 = 20</w:t>
+      </w:r>
+      <w:r>
+        <w:t xml:space="preserve">; @100 % → </w:t>
+      </w:r>
+      <w:r>
+        <w:rPr>
+          <w:rFonts w:ascii="Consolas" w:hAnsi="Consolas"/>
+        </w:rPr>
+        <w:t>82 − 13 = 69</w:t>
+      </w:r>
+      <w:r>
+        <w:t>);</w:t>
+      </w:r>
+    </w:p>
+    <w:p>
+      <w:pPr>
+        <w:pStyle w:val="ListBullet"/>
+      </w:pPr>
+      <w:r>
+        <w:rPr>
+          <w:b/>
+        </w:rPr>
+        <w:t>Cena cloudletů</w:t>
+      </w:r>
+      <w:r>
+        <w:t xml:space="preserve"> = </w:t>
+      </w:r>
+      <w:r>
+        <w:rPr>
+          <w:rFonts w:ascii="Consolas" w:hAnsi="Consolas"/>
+        </w:rPr>
+        <w:t>band(R, rezervované sazby) + band(D, dynamické sazby)</w:t>
       </w:r>
       <w:r>
         <w:t xml:space="preserve">, kde </w:t>
@@ -2433,22 +2511,30 @@
         <w:t>n</w:t>
       </w:r>
       <w:r>
-        <w:t xml:space="preserve"> do pásem (např. N=82: 16×98.84 + 16×93.88 + 32×88.91 + 18×84.02 = </w:t>
+        <w:t xml:space="preserve"> do pásem;</w:t>
+      </w:r>
+    </w:p>
+    <w:p>
+      <w:pPr>
+        <w:pStyle w:val="ListBullet"/>
+      </w:pPr>
+      <w:r>
+        <w:t xml:space="preserve">příklad @40 %: R=13 → 13×98,84 = </w:t>
       </w:r>
       <w:r>
         <w:rPr>
           <w:b/>
         </w:rPr>
-        <w:t>7 441 Kč</w:t>
-      </w:r>
-      <w:r>
-        <w:t xml:space="preserve"> rezervované; dynamické 33 = 16×148.26 + 16×144.54 + 1×140.82 = </w:t>
+        <w:t>1 284,92 Kč</w:t>
+      </w:r>
+      <w:r>
+        <w:t xml:space="preserve">; D=20 → 16×148,26 + 4×144,54 = </w:t>
       </w:r>
       <w:r>
         <w:rPr>
           <w:b/>
         </w:rPr>
-        <w:t>4 825.62 Kč</w:t>
+        <w:t>2 950,32 Kč</w:t>
       </w:r>
       <w:r>
         <w:t xml:space="preserve">; celkem </w:t>
@@ -2457,10 +2543,45 @@
         <w:rPr>
           <w:b/>
         </w:rPr>
-        <w:t>12 266.62 Kč</w:t>
-      </w:r>
-      <w:r>
-        <w:t>).</w:t>
+        <w:t>4 235,24 Kč</w:t>
+      </w:r>
+      <w:r>
+        <w:t>;</w:t>
+      </w:r>
+    </w:p>
+    <w:p>
+      <w:pPr>
+        <w:pStyle w:val="ListBullet"/>
+      </w:pPr>
+      <w:r>
+        <w:t xml:space="preserve">příklad @100 %: R=13 → </w:t>
+      </w:r>
+      <w:r>
+        <w:rPr>
+          <w:b/>
+        </w:rPr>
+        <w:t>1 284,92 Kč</w:t>
+      </w:r>
+      <w:r>
+        <w:t xml:space="preserve">; D=69 → 16×148,26 + 16×144,54 + 32×140,82 + 5×137,09 = </w:t>
+      </w:r>
+      <w:r>
+        <w:rPr>
+          <w:b/>
+        </w:rPr>
+        <w:t>9 876,49 Kč</w:t>
+      </w:r>
+      <w:r>
+        <w:t xml:space="preserve">; celkem </w:t>
+      </w:r>
+      <w:r>
+        <w:rPr>
+          <w:b/>
+        </w:rPr>
+        <w:t>11 161,41 Kč</w:t>
+      </w:r>
+      <w:r>
+        <w:t xml:space="preserve"> (průměr ~136 Kč/cl, nikoli 2× jako předchozí model).</w:t>
       </w:r>
     </w:p>
     <w:p>

</xml_diff>

<commit_message>
Tabulka VM: sloupec Cloudlety dle utilizace (round(cl x utilization))
</commit_message>
<xml_diff>
--- a/README.docx
+++ b/README.docx
@@ -2873,7 +2873,25 @@
         <w:t>obrázek topologie</w:t>
       </w:r>
       <w:r>
-        <w:t xml:space="preserve"> (html2canvas + JSZip), pokud je k dispozici; řádky se posunou tak, aby obrázek nepřekrýval text. Sloupec „Cloudlety" v tabulce VM zobrazuje rezervovaný počet cloudletů daného VM.</w:t>
+        <w:t xml:space="preserve"> (html2canvas + JSZip), pokud je k dispozici; řádky se posunou tak, aby obrázek nepřekrýval text. Sloupec „Cloudlety" v tabulce VM zobrazuje počet cloudletů </w:t>
+      </w:r>
+      <w:r>
+        <w:rPr>
+          <w:b/>
+        </w:rPr>
+        <w:t>dle utilizace</w:t>
+      </w:r>
+      <w:r>
+        <w:t xml:space="preserve"> (</w:t>
+      </w:r>
+      <w:r>
+        <w:rPr>
+          <w:rFonts w:ascii="Consolas" w:hAnsi="Consolas"/>
+        </w:rPr>
+        <w:t>round(cl × utilization)</w:t>
+      </w:r>
+      <w:r>
+        <w:t>), nikoli maximální.</w:t>
       </w:r>
     </w:p>
     <w:p>

</xml_diff>

<commit_message>
IaaS: public IP 108 Kc/mes (jen s firewallem) prictena k celkove cene
</commit_message>
<xml_diff>
--- a/README.docx
+++ b/README.docx
@@ -715,6 +715,56 @@
             <w:r/>
             <w:r>
               <w:t>fixní měsíční poplatek „Networking a FW" (všechny závazky)</w:t>
+            </w:r>
+          </w:p>
+        </w:tc>
+        <w:tc>
+          <w:tcPr>
+            <w:tcW w:type="dxa" w:w="2880"/>
+          </w:tcPr>
+          <w:p>
+            <w:r/>
+            <w:r>
+              <w:rPr>
+                <w:rFonts w:ascii="Consolas" w:hAnsi="Consolas"/>
+              </w:rPr>
+              <w:t>108</w:t>
+            </w:r>
+          </w:p>
+        </w:tc>
+      </w:tr>
+      <w:tr>
+        <w:tc>
+          <w:tcPr>
+            <w:tcW w:type="dxa" w:w="2880"/>
+          </w:tcPr>
+          <w:p>
+            <w:r/>
+            <w:r>
+              <w:rPr>
+                <w:rFonts w:ascii="Consolas" w:hAnsi="Consolas"/>
+              </w:rPr>
+              <w:t>IaaS_PUBLIC_IP_RATE_CZK</w:t>
+            </w:r>
+          </w:p>
+        </w:tc>
+        <w:tc>
+          <w:tcPr>
+            <w:tcW w:type="dxa" w:w="2880"/>
+          </w:tcPr>
+          <w:p>
+            <w:r/>
+            <w:r>
+              <w:t>fixní měsíční poplatek „Public IP" (jen s firewallem/</w:t>
+            </w:r>
+            <w:r>
+              <w:rPr>
+                <w:rFonts w:ascii="Consolas" w:hAnsi="Consolas"/>
+              </w:rPr>
+              <w:t>opnsense</w:t>
+            </w:r>
+            <w:r>
+              <w:t>)</w:t>
             </w:r>
           </w:p>
         </w:tc>
@@ -1537,6 +1587,63 @@
           </w:p>
         </w:tc>
       </w:tr>
+      <w:tr>
+        <w:tc>
+          <w:tcPr>
+            <w:tcW w:type="dxa" w:w="1728"/>
+          </w:tcPr>
+          <w:p>
+            <w:r/>
+            <w:r>
+              <w:t>Public IP (fix měsíčně, jen s firewallem)</w:t>
+            </w:r>
+          </w:p>
+        </w:tc>
+        <w:tc>
+          <w:tcPr>
+            <w:tcW w:type="dxa" w:w="1728"/>
+          </w:tcPr>
+          <w:p>
+            <w:r/>
+            <w:r>
+              <w:t>108</w:t>
+            </w:r>
+          </w:p>
+        </w:tc>
+        <w:tc>
+          <w:tcPr>
+            <w:tcW w:type="dxa" w:w="1728"/>
+          </w:tcPr>
+          <w:p>
+            <w:r/>
+            <w:r>
+              <w:t>108</w:t>
+            </w:r>
+          </w:p>
+        </w:tc>
+        <w:tc>
+          <w:tcPr>
+            <w:tcW w:type="dxa" w:w="1728"/>
+          </w:tcPr>
+          <w:p>
+            <w:r/>
+            <w:r>
+              <w:t>108</w:t>
+            </w:r>
+          </w:p>
+        </w:tc>
+        <w:tc>
+          <w:tcPr>
+            <w:tcW w:type="dxa" w:w="1728"/>
+          </w:tcPr>
+          <w:p>
+            <w:r/>
+            <w:r>
+              <w:t>108</w:t>
+            </w:r>
+          </w:p>
+        </w:tc>
+      </w:tr>
     </w:tbl>
     <w:p/>
     <w:p>
@@ -1594,6 +1701,8 @@
         <w:t xml:space="preserve">              + Σ disk GB × sazba (dle tieru každého VM)</w:t>
         <w:br/>
         <w:t xml:space="preserve">              + "Networking a FW"                  (fixní, 108 Kč, všechny závazky)</w:t>
+        <w:br/>
+        <w:t xml:space="preserve">              + "Public IP"                        (108 Kč, jen pokud je firewall / skupina opnsense)</w:t>
       </w:r>
     </w:p>
     <w:p>

</xml_diff>

<commit_message>
Zrusen poplatek Networking + FW (108 Kc) - neexistuje; zustava jen Public IP
</commit_message>
<xml_diff>
--- a/README.docx
+++ b/README.docx
@@ -688,47 +688,6 @@
                 <w:rFonts w:ascii="Consolas" w:hAnsi="Consolas"/>
               </w:rPr>
               <w:t>40</w:t>
-            </w:r>
-          </w:p>
-        </w:tc>
-      </w:tr>
-      <w:tr>
-        <w:tc>
-          <w:tcPr>
-            <w:tcW w:type="dxa" w:w="2880"/>
-          </w:tcPr>
-          <w:p>
-            <w:r/>
-            <w:r>
-              <w:rPr>
-                <w:rFonts w:ascii="Consolas" w:hAnsi="Consolas"/>
-              </w:rPr>
-              <w:t>IaaS_NETWORK_FW_RATE_CZK</w:t>
-            </w:r>
-          </w:p>
-        </w:tc>
-        <w:tc>
-          <w:tcPr>
-            <w:tcW w:type="dxa" w:w="2880"/>
-          </w:tcPr>
-          <w:p>
-            <w:r/>
-            <w:r>
-              <w:t>fixní měsíční poplatek „Networking a FW" (všechny závazky)</w:t>
-            </w:r>
-          </w:p>
-        </w:tc>
-        <w:tc>
-          <w:tcPr>
-            <w:tcW w:type="dxa" w:w="2880"/>
-          </w:tcPr>
-          <w:p>
-            <w:r/>
-            <w:r>
-              <w:rPr>
-                <w:rFonts w:ascii="Consolas" w:hAnsi="Consolas"/>
-              </w:rPr>
-              <w:t>108</w:t>
             </w:r>
           </w:p>
         </w:tc>
@@ -1538,63 +1497,6 @@
           <w:p>
             <w:r/>
             <w:r>
-              <w:t>Networking a FW (fix měsíčně)</w:t>
-            </w:r>
-          </w:p>
-        </w:tc>
-        <w:tc>
-          <w:tcPr>
-            <w:tcW w:type="dxa" w:w="1728"/>
-          </w:tcPr>
-          <w:p>
-            <w:r/>
-            <w:r>
-              <w:t>108</w:t>
-            </w:r>
-          </w:p>
-        </w:tc>
-        <w:tc>
-          <w:tcPr>
-            <w:tcW w:type="dxa" w:w="1728"/>
-          </w:tcPr>
-          <w:p>
-            <w:r/>
-            <w:r>
-              <w:t>108</w:t>
-            </w:r>
-          </w:p>
-        </w:tc>
-        <w:tc>
-          <w:tcPr>
-            <w:tcW w:type="dxa" w:w="1728"/>
-          </w:tcPr>
-          <w:p>
-            <w:r/>
-            <w:r>
-              <w:t>108</w:t>
-            </w:r>
-          </w:p>
-        </w:tc>
-        <w:tc>
-          <w:tcPr>
-            <w:tcW w:type="dxa" w:w="1728"/>
-          </w:tcPr>
-          <w:p>
-            <w:r/>
-            <w:r>
-              <w:t>108</w:t>
-            </w:r>
-          </w:p>
-        </w:tc>
-      </w:tr>
-      <w:tr>
-        <w:tc>
-          <w:tcPr>
-            <w:tcW w:type="dxa" w:w="1728"/>
-          </w:tcPr>
-          <w:p>
-            <w:r/>
-            <w:r>
               <w:t>Public IP (fix měsíčně, jen s firewallem)</w:t>
             </w:r>
           </w:p>
@@ -1699,8 +1601,6 @@
         <w:t xml:space="preserve">              + Σ RAM GB × sazbaRAM</w:t>
         <w:br/>
         <w:t xml:space="preserve">              + Σ disk GB × sazba (dle tieru každého VM)</w:t>
-        <w:br/>
-        <w:t xml:space="preserve">              + "Networking a FW"                  (fixní, 108 Kč, všechny závazky)</w:t>
         <w:br/>
         <w:t xml:space="preserve">              + "Public IP"                        (108 Kč, jen pokud je firewall / skupina opnsense)</w:t>
       </w:r>

</xml_diff>

<commit_message>
PaaS ceny konfigurovatelne pres .env (paas vstupy: rezervace, pasma, sazby, disk, IP)
</commit_message>
<xml_diff>
--- a/README.docx
+++ b/README.docx
@@ -738,6 +738,252 @@
                 <w:rFonts w:ascii="Consolas" w:hAnsi="Consolas"/>
               </w:rPr>
               <w:t>108</w:t>
+            </w:r>
+          </w:p>
+        </w:tc>
+      </w:tr>
+      <w:tr>
+        <w:tc>
+          <w:tcPr>
+            <w:tcW w:type="dxa" w:w="2880"/>
+          </w:tcPr>
+          <w:p>
+            <w:r/>
+            <w:r>
+              <w:rPr>
+                <w:rFonts w:ascii="Consolas" w:hAnsi="Consolas"/>
+              </w:rPr>
+              <w:t>IaaS_PAAS_RESERVATION_PCT</w:t>
+            </w:r>
+          </w:p>
+        </w:tc>
+        <w:tc>
+          <w:tcPr>
+            <w:tcW w:type="dxa" w:w="2880"/>
+          </w:tcPr>
+          <w:p>
+            <w:r/>
+            <w:r>
+              <w:t>rezervované cloudlety = vždy placené minimum (% z celku, PaaS)</w:t>
+            </w:r>
+          </w:p>
+        </w:tc>
+        <w:tc>
+          <w:tcPr>
+            <w:tcW w:type="dxa" w:w="2880"/>
+          </w:tcPr>
+          <w:p>
+            <w:r/>
+            <w:r>
+              <w:rPr>
+                <w:rFonts w:ascii="Consolas" w:hAnsi="Consolas"/>
+              </w:rPr>
+              <w:t>15</w:t>
+            </w:r>
+          </w:p>
+        </w:tc>
+      </w:tr>
+      <w:tr>
+        <w:tc>
+          <w:tcPr>
+            <w:tcW w:type="dxa" w:w="2880"/>
+          </w:tcPr>
+          <w:p>
+            <w:r/>
+            <w:r>
+              <w:rPr>
+                <w:rFonts w:ascii="Consolas" w:hAnsi="Consolas"/>
+              </w:rPr>
+              <w:t>IaaS_PAAS_RESERVED_RATES</w:t>
+            </w:r>
+          </w:p>
+        </w:tc>
+        <w:tc>
+          <w:tcPr>
+            <w:tcW w:type="dxa" w:w="2880"/>
+          </w:tcPr>
+          <w:p>
+            <w:r/>
+            <w:r>
+              <w:t>rezervované sazby PaaS cloudletů (Kč/cl/měs, po pásmech, oddělené čárkou)</w:t>
+            </w:r>
+          </w:p>
+        </w:tc>
+        <w:tc>
+          <w:tcPr>
+            <w:tcW w:type="dxa" w:w="2880"/>
+          </w:tcPr>
+          <w:p>
+            <w:r/>
+            <w:r>
+              <w:rPr>
+                <w:rFonts w:ascii="Consolas" w:hAnsi="Consolas"/>
+              </w:rPr>
+              <w:t>98.84,93.88,88.91,84.02,79.06</w:t>
+            </w:r>
+          </w:p>
+        </w:tc>
+      </w:tr>
+      <w:tr>
+        <w:tc>
+          <w:tcPr>
+            <w:tcW w:type="dxa" w:w="2880"/>
+          </w:tcPr>
+          <w:p>
+            <w:r/>
+            <w:r>
+              <w:rPr>
+                <w:rFonts w:ascii="Consolas" w:hAnsi="Consolas"/>
+              </w:rPr>
+              <w:t>IaaS_PAAS_DYNAMIC_RATES</w:t>
+            </w:r>
+          </w:p>
+        </w:tc>
+        <w:tc>
+          <w:tcPr>
+            <w:tcW w:type="dxa" w:w="2880"/>
+          </w:tcPr>
+          <w:p>
+            <w:r/>
+            <w:r>
+              <w:t>dynamické sazby PaaS cloudletů (Kč/cl/měs, po pásmech)</w:t>
+            </w:r>
+          </w:p>
+        </w:tc>
+        <w:tc>
+          <w:tcPr>
+            <w:tcW w:type="dxa" w:w="2880"/>
+          </w:tcPr>
+          <w:p>
+            <w:r/>
+            <w:r>
+              <w:rPr>
+                <w:rFonts w:ascii="Consolas" w:hAnsi="Consolas"/>
+              </w:rPr>
+              <w:t>148.26,144.54,140.82,137.09,133.44</w:t>
+            </w:r>
+          </w:p>
+        </w:tc>
+      </w:tr>
+      <w:tr>
+        <w:tc>
+          <w:tcPr>
+            <w:tcW w:type="dxa" w:w="2880"/>
+          </w:tcPr>
+          <w:p>
+            <w:r/>
+            <w:r>
+              <w:rPr>
+                <w:rFonts w:ascii="Consolas" w:hAnsi="Consolas"/>
+              </w:rPr>
+              <w:t>IaaS_PAAS_BANDS</w:t>
+            </w:r>
+          </w:p>
+        </w:tc>
+        <w:tc>
+          <w:tcPr>
+            <w:tcW w:type="dxa" w:w="2880"/>
+          </w:tcPr>
+          <w:p>
+            <w:r/>
+            <w:r>
+              <w:t>horní hranice pásem cloudletů (poslední pásmo se automaticky doplní na ∞)</w:t>
+            </w:r>
+          </w:p>
+        </w:tc>
+        <w:tc>
+          <w:tcPr>
+            <w:tcW w:type="dxa" w:w="2880"/>
+          </w:tcPr>
+          <w:p>
+            <w:r/>
+            <w:r>
+              <w:rPr>
+                <w:rFonts w:ascii="Consolas" w:hAnsi="Consolas"/>
+              </w:rPr>
+              <w:t>16,32,64,128</w:t>
+            </w:r>
+          </w:p>
+        </w:tc>
+      </w:tr>
+      <w:tr>
+        <w:tc>
+          <w:tcPr>
+            <w:tcW w:type="dxa" w:w="2880"/>
+          </w:tcPr>
+          <w:p>
+            <w:r/>
+            <w:r>
+              <w:rPr>
+                <w:rFonts w:ascii="Consolas" w:hAnsi="Consolas"/>
+              </w:rPr>
+              <w:t>IaaS_PAAS_DISK_RATE_CZK</w:t>
+            </w:r>
+          </w:p>
+        </w:tc>
+        <w:tc>
+          <w:tcPr>
+            <w:tcW w:type="dxa" w:w="2880"/>
+          </w:tcPr>
+          <w:p>
+            <w:r/>
+            <w:r>
+              <w:t>PaaS cena disku (Kč/GB/měs)</w:t>
+            </w:r>
+          </w:p>
+        </w:tc>
+        <w:tc>
+          <w:tcPr>
+            <w:tcW w:type="dxa" w:w="2880"/>
+          </w:tcPr>
+          <w:p>
+            <w:r/>
+            <w:r>
+              <w:rPr>
+                <w:rFonts w:ascii="Consolas" w:hAnsi="Consolas"/>
+              </w:rPr>
+              <w:t>2.40</w:t>
+            </w:r>
+          </w:p>
+        </w:tc>
+      </w:tr>
+      <w:tr>
+        <w:tc>
+          <w:tcPr>
+            <w:tcW w:type="dxa" w:w="2880"/>
+          </w:tcPr>
+          <w:p>
+            <w:r/>
+            <w:r>
+              <w:rPr>
+                <w:rFonts w:ascii="Consolas" w:hAnsi="Consolas"/>
+              </w:rPr>
+              <w:t>IaaS_PAAS_PUBLIC_IP_RATE_CZK</w:t>
+            </w:r>
+          </w:p>
+        </w:tc>
+        <w:tc>
+          <w:tcPr>
+            <w:tcW w:type="dxa" w:w="2880"/>
+          </w:tcPr>
+          <w:p>
+            <w:r/>
+            <w:r>
+              <w:t>PaaS Public IP (Kč/IP/měs, jen s firewallem)</w:t>
+            </w:r>
+          </w:p>
+        </w:tc>
+        <w:tc>
+          <w:tcPr>
+            <w:tcW w:type="dxa" w:w="2880"/>
+          </w:tcPr>
+          <w:p>
+            <w:r/>
+            <w:r>
+              <w:rPr>
+                <w:rFonts w:ascii="Consolas" w:hAnsi="Consolas"/>
+              </w:rPr>
+              <w:t>120.01</w:t>
             </w:r>
           </w:p>
         </w:tc>

</xml_diff>

<commit_message>
IaaS: Remote backup (0,68 Kč/GB/mes, celkem disk)
</commit_message>
<xml_diff>
--- a/README.docx
+++ b/README.docx
@@ -688,6 +688,47 @@
                 <w:rFonts w:ascii="Consolas" w:hAnsi="Consolas"/>
               </w:rPr>
               <w:t>40</w:t>
+            </w:r>
+          </w:p>
+        </w:tc>
+      </w:tr>
+      <w:tr>
+        <w:tc>
+          <w:tcPr>
+            <w:tcW w:type="dxa" w:w="2880"/>
+          </w:tcPr>
+          <w:p>
+            <w:r/>
+            <w:r>
+              <w:rPr>
+                <w:rFonts w:ascii="Consolas" w:hAnsi="Consolas"/>
+              </w:rPr>
+              <w:t>IaaS_REMOTE_BACKUP_RATE_CZK</w:t>
+            </w:r>
+          </w:p>
+        </w:tc>
+        <w:tc>
+          <w:tcPr>
+            <w:tcW w:type="dxa" w:w="2880"/>
+          </w:tcPr>
+          <w:p>
+            <w:r/>
+            <w:r>
+              <w:t>cena Remote backup (Kč/GB/měsíc, × celkový disk)</w:t>
+            </w:r>
+          </w:p>
+        </w:tc>
+        <w:tc>
+          <w:tcPr>
+            <w:tcW w:type="dxa" w:w="2880"/>
+          </w:tcPr>
+          <w:p>
+            <w:r/>
+            <w:r>
+              <w:rPr>
+                <w:rFonts w:ascii="Consolas" w:hAnsi="Consolas"/>
+              </w:rPr>
+              <w:t>0,68</w:t>
             </w:r>
           </w:p>
         </w:tc>
@@ -1848,6 +1889,8 @@
         <w:br/>
         <w:t xml:space="preserve">              + Σ disk GB × sazba (dle tieru každého VM)</w:t>
         <w:br/>
+        <w:t xml:space="preserve">              + Σ disk GB × 0,68 Kč          (Remote backup, za každý GB celkového disku)</w:t>
+        <w:br/>
         <w:t xml:space="preserve">              + "Public IP"                        (108 Kč, jen pokud je firewall / skupina opnsense)</w:t>
       </w:r>
     </w:p>
@@ -2086,6 +2129,47 @@
       </w:r>
       <w:r>
         <w:t xml:space="preserve"> + počet VM v každé skupině.</w:t>
+      </w:r>
+    </w:p>
+    <w:p>
+      <w:pPr>
+        <w:pStyle w:val="ListNumber"/>
+      </w:pPr>
+      <w:r>
+        <w:rPr>
+          <w:b/>
+        </w:rPr>
+        <w:t>Remote backup</w:t>
+      </w:r>
+      <w:r>
+        <w:t xml:space="preserve">: </w:t>
+      </w:r>
+      <w:r>
+        <w:rPr>
+          <w:rFonts w:ascii="Consolas" w:hAnsi="Consolas"/>
+        </w:rPr>
+        <w:t>celkový disk × 0,68 Kč</w:t>
+      </w:r>
+      <w:r>
+        <w:t xml:space="preserve"> (nebo </w:t>
+      </w:r>
+      <w:r>
+        <w:rPr>
+          <w:rFonts w:ascii="Consolas" w:hAnsi="Consolas"/>
+        </w:rPr>
+        <w:t>IaaS_REMOTE_BACKUP_RATE_CZK</w:t>
+      </w:r>
+      <w:r>
+        <w:t xml:space="preserve"> z </w:t>
+      </w:r>
+      <w:r>
+        <w:rPr>
+          <w:rFonts w:ascii="Consolas" w:hAnsi="Consolas"/>
+        </w:rPr>
+        <w:t>.env</w:t>
+      </w:r>
+      <w:r>
+        <w:t>). Připočítává se k celkové ceně a zobrazuje se v IaaS panelu i v Excelu.</w:t>
       </w:r>
     </w:p>
     <w:p>

</xml_diff>

<commit_message>
Disk: zrusen synteticky Basic svazek (only real tier rows); PaaS Disk podle tieru = jen Soucet
</commit_message>
<xml_diff>
--- a/README.docx
+++ b/README.docx
@@ -1889,7 +1889,7 @@
         <w:br/>
         <w:t xml:space="preserve">              + Σ disk GB × sazba (dle tieru každého VM)</w:t>
         <w:br/>
-        <w:t xml:space="preserve">              + Σ disk GB × 0,68 Kč          (Remote backup, za každý GB celkového disku)</w:t>
+        <w:t xml:space="preserve">              + Σ disk GB × 2 × 0,68 Kč        (Remote backup, 2× celkový disk × sazba)</w:t>
         <w:br/>
         <w:t xml:space="preserve">              + "Public IP"                        (108 Kč, jen pokud je firewall / skupina opnsense)</w:t>
       </w:r>
@@ -1973,16 +1973,10 @@
         <w:rPr>
           <w:rFonts w:ascii="Consolas" w:hAnsi="Consolas"/>
         </w:rPr>
-        <w:t>diskCost = diskGB × (sazbaTieru + sazbaBasic)</w:t>
-      </w:r>
-      <w:r>
-        <w:t xml:space="preserve"> — BC kalkulačka si k VM disku v výkonnostním tieru vždy přičte ještě </w:t>
-      </w:r>
-      <w:r>
-        <w:rPr>
-          <w:b/>
-        </w:rPr>
-        <w:t>základní „Basic" svazek stejné velikosti</w:t>
+        <w:t>diskCost = diskGB × sazbaTieru</w:t>
+      </w:r>
+      <w:r>
+        <w:t xml:space="preserve"> — disk VM se účtuje jen sazbou svého výkonnostního tieru (žádný syntetický „Basic" svazek navíc)</w:t>
       </w:r>
     </w:p>
     <w:p>
@@ -2064,7 +2058,7 @@
         <w:t>diskCostCZK (celkem) = Σ per-node diskCost</w:t>
       </w:r>
       <w:r>
-        <w:t xml:space="preserve"> (= Σ výkonnostní tiery + celkový disk na Basic sazbě).</w:t>
+        <w:t xml:space="preserve"> (= Σ disky tierů × jejich sazby).</w:t>
       </w:r>
     </w:p>
     <w:p>
@@ -2087,25 +2081,16 @@
         <w:t>diskByTier</w:t>
       </w:r>
       <w:r>
-        <w:t xml:space="preserve">): pro tierdeklarace Super Fast / Fast / Standard se sečtou GB všech VM daného tieru × sazba tieru; navíc vždy přibude řádek </w:t>
+        <w:t xml:space="preserve">): sečtou se GB všech VM daného tieru × sazba tieru; řádek tieru se zobrazí </w:t>
       </w:r>
       <w:r>
         <w:rPr>
           <w:b/>
         </w:rPr>
-        <w:t>`Basic (základ)`</w:t>
-      </w:r>
-      <w:r>
-        <w:t xml:space="preserve"> = </w:t>
-      </w:r>
-      <w:r>
-        <w:rPr>
-          <w:b/>
-        </w:rPr>
-        <w:t>celkový disk všech VM</w:t>
-      </w:r>
-      <w:r>
-        <w:t xml:space="preserve"> × sazba Basic.</w:t>
+        <w:t>jen když topologie reálně obsahuje VM s tímto tierem</w:t>
+      </w:r>
+      <w:r>
+        <w:t xml:space="preserve"> (Super Fast / Fast / Standard / Basic). Žádné syntetické řádky.</w:t>
       </w:r>
     </w:p>
     <w:p>
@@ -2148,7 +2133,7 @@
         <w:rPr>
           <w:rFonts w:ascii="Consolas" w:hAnsi="Consolas"/>
         </w:rPr>
-        <w:t>celkový disk × 0,68 Kč</w:t>
+        <w:t>2 × celkový disk × 0,68 Kč</w:t>
       </w:r>
       <w:r>
         <w:t xml:space="preserve"> (nebo </w:t>

</xml_diff>

<commit_message>
Default topologie: Sec-01 Fast 4+4+50, App-01 8+4+100, Db-01 4+4+300 (envName prazdny)
</commit_message>
<xml_diff>
--- a/README.docx
+++ b/README.docx
@@ -3246,7 +3246,7 @@
         <w:t>Sec-01</w:t>
       </w:r>
       <w:r>
-        <w:t xml:space="preserve"> (OPNsense, Standard, 4+4+20) + </w:t>
+        <w:t xml:space="preserve"> (OPNsense, Fast, 4+4+50) + </w:t>
       </w:r>
       <w:r>
         <w:rPr>
@@ -3255,16 +3255,16 @@
         <w:t>App-01</w:t>
       </w:r>
       <w:r>
-        <w:t xml:space="preserve"> (Standard, 7.2+2.25+50) + </w:t>
+        <w:t xml:space="preserve"> (Standard, 8+4+100) + </w:t>
       </w:r>
       <w:r>
         <w:rPr>
           <w:rFonts w:ascii="Consolas" w:hAnsi="Consolas"/>
         </w:rPr>
-        <w:t>DB-01</w:t>
-      </w:r>
-      <w:r>
-        <w:t xml:space="preserve"> (Fast, 4+4+120). Pokud existuje </w:t>
+        <w:t>Db-01</w:t>
+      </w:r>
+      <w:r>
+        <w:t xml:space="preserve"> (Fast, 4+4+300). Pokud existuje </w:t>
       </w:r>
       <w:r>
         <w:rPr>
@@ -3314,7 +3314,7 @@
         <w:rPr>
           <w:rFonts w:ascii="Consolas" w:hAnsi="Consolas"/>
         </w:rPr>
-        <w:t>envName = dev-kube.prg1paas.t-cloud.eu</w:t>
+        <w:t>envName = ""</w:t>
       </w:r>
       <w:r>
         <w:t xml:space="preserve">, skupinové labely </w:t>
@@ -3362,16 +3362,34 @@
         <w:t>Firewall/LoadBalancing</w:t>
       </w:r>
       <w:r>
-        <w:t xml:space="preserve">. Skupina firewallu je v JSON </w:t>
+        <w:t xml:space="preserve">. Skupina firewallu je </w:t>
       </w:r>
       <w:r>
         <w:rPr>
-          <w:b/>
+          <w:rFonts w:ascii="Consolas" w:hAnsi="Consolas"/>
         </w:rPr>
-        <w:t>`security`</w:t>
-      </w:r>
-      <w:r>
-        <w:t xml:space="preserve"> — </w:t>
+        <w:t>opnsense</w:t>
+      </w:r>
+      <w:r>
+        <w:t xml:space="preserve">; u ručně nahraných </w:t>
+      </w:r>
+      <w:r>
+        <w:rPr>
+          <w:rFonts w:ascii="Consolas" w:hAnsi="Consolas"/>
+        </w:rPr>
+        <w:t>.topo.json</w:t>
+      </w:r>
+      <w:r>
+        <w:t xml:space="preserve"> s </w:t>
+      </w:r>
+      <w:r>
+        <w:rPr>
+          <w:rFonts w:ascii="Consolas" w:hAnsi="Consolas"/>
+        </w:rPr>
+        <w:t>security</w:t>
+      </w:r>
+      <w:r>
+        <w:t xml:space="preserve"> ji </w:t>
       </w:r>
       <w:r>
         <w:rPr>
@@ -3389,7 +3407,7 @@
         <w:t>lib/architecture.js</w:t>
       </w:r>
       <w:r>
-        <w:t xml:space="preserve"> ji </w:t>
+        <w:t xml:space="preserve"> </w:t>
       </w:r>
       <w:r>
         <w:rPr>
@@ -3398,16 +3416,7 @@
         <w:t>aliasuje na `opnsense`</w:t>
       </w:r>
       <w:r>
-        <w:t xml:space="preserve">, takže uzel zůstává v topologii (renderuje se jako firewall s veřejnou IP na NIC). Alias platí i pro ručně nahrané </w:t>
-      </w:r>
-      <w:r>
-        <w:rPr>
-          <w:rFonts w:ascii="Consolas" w:hAnsi="Consolas"/>
-        </w:rPr>
-        <w:t>.topo.json</w:t>
-      </w:r>
-      <w:r>
-        <w:t>.</w:t>
+        <w:t>, takže uzel zůstává v topologii (renderuje se jako firewall s veřejnou IP na NIC).</w:t>
       </w:r>
     </w:p>
     <w:p>

</xml_diff>

<commit_message>
PaaS disk = sazba IaaS tieru Standard dle zavazku (12m 1.35); IaaS_PAAS_DISK_RATE_CZK jen jako override
</commit_message>
<xml_diff>
--- a/README.docx
+++ b/README.docx
@@ -969,7 +969,16 @@
           <w:p>
             <w:r/>
             <w:r>
-              <w:t>PaaS cena disku (Kč/GB/měs)</w:t>
+              <w:t xml:space="preserve">PaaS disk </w:t>
+            </w:r>
+            <w:r>
+              <w:rPr>
+                <w:b/>
+              </w:rPr>
+              <w:t>override</w:t>
+            </w:r>
+            <w:r>
+              <w:t xml:space="preserve"> (plochá Kč/GB/měs); prázdné = sazba IaaS tieru „Standard" dle závazku</w:t>
             </w:r>
           </w:p>
         </w:tc>
@@ -981,9 +990,9 @@
             <w:r/>
             <w:r>
               <w:rPr>
-                <w:rFonts w:ascii="Consolas" w:hAnsi="Consolas"/>
+                <w:i/>
               </w:rPr>
-              <w:t>2.40</w:t>
+              <w:t>(prázdné)</w:t>
             </w:r>
           </w:p>
         </w:tc>
@@ -2989,10 +2998,19 @@
         <w:rPr>
           <w:b/>
         </w:rPr>
-        <w:t>2.40 Kč/GB/měs</w:t>
-      </w:r>
-      <w:r>
-        <w:t xml:space="preserve"> (0.003286 Kč/h × 730);</w:t>
+        <w:t>sazba IaaS tieru „Standard" dle závazku</w:t>
+      </w:r>
+      <w:r>
+        <w:t xml:space="preserve"> (bez závazku 1.95 / 12m 1.35 / 24m 1.28 / 36m 1.20 Kč/GB/měs); </w:t>
+      </w:r>
+      <w:r>
+        <w:rPr>
+          <w:rFonts w:ascii="Consolas" w:hAnsi="Consolas"/>
+        </w:rPr>
+        <w:t>IaaS_PAAS_DISK_RATE_CZK</w:t>
+      </w:r>
+      <w:r>
+        <w:t xml:space="preserve"> ji může přebít plochou sazbou;</w:t>
       </w:r>
     </w:p>
     <w:p>

</xml_diff>

<commit_message>
IaaS: Internet konektivita (100/500/1000 Mbps x zavazek; web + Excel, env override)
</commit_message>
<xml_diff>
--- a/README.docx
+++ b/README.docx
@@ -767,6 +767,38 @@
           </w:tcPr>
           <w:p>
             <w:r>
+              <w:t>IaaS_INTERNET_RATES</w:t>
+            </w:r>
+          </w:p>
+        </w:tc>
+        <w:tc>
+          <w:tcPr>
+            <w:tcW w:type="dxa" w:w="2880"/>
+          </w:tcPr>
+          <w:p>
+            <w:r>
+              <w:t>Internetová konektivita Kč/měs dle rychlosti a závazku (0,12,24,36)</w:t>
+            </w:r>
+          </w:p>
+        </w:tc>
+        <w:tc>
+          <w:tcPr>
+            <w:tcW w:type="dxa" w:w="2880"/>
+          </w:tcPr>
+          <w:p>
+            <w:r>
+              <w:t>100:700,630,595,560;500:1800,1620,1530,1440;1000:3200,2880,2720,2560</w:t>
+            </w:r>
+          </w:p>
+        </w:tc>
+      </w:tr>
+      <w:tr>
+        <w:tc>
+          <w:tcPr>
+            <w:tcW w:type="dxa" w:w="2880"/>
+          </w:tcPr>
+          <w:p>
+            <w:r>
               <w:t>TCLOUD_BASE_URL</w:t>
             </w:r>
           </w:p>
@@ -1429,6 +1461,11 @@
     <w:p>
       <w:r>
         <w:t>+ "Public IP"                        (108 Kč, jen pokud je firewall / skupina opnsense)</w:t>
+      </w:r>
+    </w:p>
+    <w:p>
+      <w:r>
+        <w:t>+ "Internet"                         (dle rychlosti a závazku, jen s firewallem)</w:t>
       </w:r>
     </w:p>
     <w:p>

</xml_diff>

<commit_message>
IaaS: Static public IPv4 0-10 ks dle zavazku (156/108/102/96 Kc/IP; web + Excel, env override)
</commit_message>
<xml_diff>
--- a/README.docx
+++ b/README.docx
@@ -489,7 +489,7 @@
           </w:tcPr>
           <w:p>
             <w:r>
-              <w:t>fixní měsíční poplatek „Public IP" (jen s firewallem/opnsense)</w:t>
+              <w:t>sazba Public IP (Kč/IP/měs) pro výchozí závazek 12m (legacy; přednost má IaaS_PUBLIC_IP_RATES)</w:t>
             </w:r>
           </w:p>
         </w:tc>
@@ -500,6 +500,38 @@
           <w:p>
             <w:r>
               <w:t>108</w:t>
+            </w:r>
+          </w:p>
+        </w:tc>
+      </w:tr>
+      <w:tr>
+        <w:tc>
+          <w:tcPr>
+            <w:tcW w:type="dxa" w:w="2880"/>
+          </w:tcPr>
+          <w:p>
+            <w:r>
+              <w:t>IaaS_PUBLIC_IP_RATES</w:t>
+            </w:r>
+          </w:p>
+        </w:tc>
+        <w:tc>
+          <w:tcPr>
+            <w:tcW w:type="dxa" w:w="2880"/>
+          </w:tcPr>
+          <w:p>
+            <w:r>
+              <w:t>Static public IPv4 Kč/IP/měs dle závazku: bez závazku, 12, 24, 36</w:t>
+            </w:r>
+          </w:p>
+        </w:tc>
+        <w:tc>
+          <w:tcPr>
+            <w:tcW w:type="dxa" w:w="2880"/>
+          </w:tcPr>
+          <w:p>
+            <w:r>
+              <w:t>156,108,102,96</w:t>
             </w:r>
           </w:p>
         </w:tc>
@@ -1359,7 +1391,17 @@
           </w:tcPr>
           <w:p>
             <w:r>
-              <w:t>Public IP (fix měsíčně, jen s firewallem)</w:t>
+              <w:t>Public IP (Static public IPv4, za IP/měs, jen s firewallem)</w:t>
+            </w:r>
+          </w:p>
+        </w:tc>
+        <w:tc>
+          <w:tcPr>
+            <w:tcW w:type="dxa" w:w="1728"/>
+          </w:tcPr>
+          <w:p>
+            <w:r>
+              <w:t>156</w:t>
             </w:r>
           </w:p>
         </w:tc>
@@ -1379,7 +1421,7 @@
           </w:tcPr>
           <w:p>
             <w:r>
-              <w:t>108</w:t>
+              <w:t>102</w:t>
             </w:r>
           </w:p>
         </w:tc>
@@ -1389,17 +1431,7 @@
           </w:tcPr>
           <w:p>
             <w:r>
-              <w:t>108</w:t>
-            </w:r>
-          </w:p>
-        </w:tc>
-        <w:tc>
-          <w:tcPr>
-            <w:tcW w:type="dxa" w:w="1728"/>
-          </w:tcPr>
-          <w:p>
-            <w:r>
-              <w:t>108</w:t>
+              <w:t>96</w:t>
             </w:r>
           </w:p>
         </w:tc>
@@ -1460,7 +1492,7 @@
     </w:p>
     <w:p>
       <w:r>
-        <w:t>+ "Public IP"                        (108 Kč, jen pokud je firewall / skupina opnsense)</w:t>
+        <w:t>+ "Public IP"                        (Static public IPv4, 0–10 ks × sazba dle závazku, jen s firewallem)</w:t>
       </w:r>
     </w:p>
     <w:p>

</xml_diff>

<commit_message>
Excel: cenova nabidka (formalni dokument: zakaznik, polozky IaaS+PaaS, soucty, rozpis VM, podpisy)
</commit_message>
<xml_diff>
--- a/README.docx
+++ b/README.docx
@@ -1835,6 +1835,11 @@
       </w:r>
     </w:p>
     <w:p>
+      <w:r>
+        <w:t>Tlačítko „Cenová nabídka (Excel)" (exportOfferExcel) generuje formální obchodní dokument: hlavička CENOVÁ NABÍDKA (datum vystavení, platnost 30 dní), předmět s názvem prostředí, místa pro zákazníka, rozdělené IaaS a PaaS cenové položky (CPU/RAM/Disk/Remote backup/Public IP/Internet resp. Cloudlety/Disk/Public IP/External traffic) s měsíčními součty, poznámky (ceny bez DPH), rozpis VM a podpisové kolonky; nahoře je obrázek topologie. Obě funkce sdílejí writeXlsx (styling přes JSZip).</w:t>
+      </w:r>
+    </w:p>
+    <w:p>
       <w:pPr>
         <w:pStyle w:val="Heading3"/>
       </w:pPr>

</xml_diff>